<commit_message>
chore(career): remove Figma project and sync related assets
</commit_message>
<xml_diff>
--- a/.career/opportunities/2026-infinigence-webui/outputs/钟杰-前端工程师-无问芯穹.docx
+++ b/.career/opportunities/2026-infinigence-webui/outputs/钟杰-前端工程师-无问芯穹.docx
@@ -59,188 +59,6 @@
                           <w:p>
                             <w:pPr>
                               <w:pStyle w:val="a3"/>
-                              <w:spacing w:before="0" w:after="80" w:line="360" w:lineRule="exact"/>
-                              <w:jc w:val="left"/>
-                              <w:rPr>
-                                <w:rFonts w:ascii="Microsoft YaHei" w:hAnsi="Microsoft YaHei" w:eastAsia="Microsoft YaHei" w:cs="Microsoft YaHei"/>
-                                <w:b/>
-                                <w:bCs/>
-                                <w:kern w:val="24"/>
-                                <w:sz w:val="22"/>
-                                <w:szCs w:val="22"/>
-                                <w:lang w:val="zh-TW" w:eastAsia="zh-TW"/>
-                              </w:rPr>
-                            </w:pPr>
-                            <w:r>
-                              <w:rPr>
-                                <w:rFonts w:hint="eastAsia" w:ascii="Microsoft YaHei" w:hAnsi="Microsoft YaHei" w:eastAsia="Microsoft YaHei" w:cs="Microsoft YaHei"/>
-                                <w:b/>
-                                <w:bCs/>
-                                <w:kern w:val="24"/>
-                                <w:sz w:val="22"/>
-                                <w:szCs w:val="22"/>
-                              </w:rPr>
-                              <w:t xml:space="preserve">类 Figma AI 设计与应用生成｜上海鼎歆</w:t>
-                            </w:r>
-                          </w:p>
-                          <w:p>
-                            <w:pPr>
-                              <w:pStyle w:val="a3"/>
-                              <w:spacing w:before="0" w:after="80" w:line="320" w:lineRule="exact"/>
-                              <w:jc w:val="left"/>
-                              <w:rPr>
-                                <w:rFonts w:ascii="Microsoft YaHei" w:hAnsi="Microsoft YaHei" w:eastAsia="Microsoft YaHei" w:cs="Microsoft YaHei"/>
-                                <w:color w:val="4C4C4C"/>
-                                <w:kern w:val="24"/>
-                                <w:sz w:val="20"/>
-                                <w:szCs w:val="20"/>
-                                <w:u w:color="545454"/>
-                                <w:lang w:eastAsia="zh-TW"/>
-                              </w:rPr>
-                            </w:pPr>
-                            <w:r>
-                              <w:rPr>
-                                <w:rFonts w:hint="eastAsia" w:ascii="Microsoft YaHei" w:hAnsi="Microsoft YaHei" w:eastAsia="Microsoft YaHei" w:cs="Microsoft YaHei"/>
-                                <w:color w:val="4C4C4C"/>
-                                <w:kern w:val="24"/>
-                                <w:sz w:val="20"/>
-                                <w:szCs w:val="20"/>
-                                <w:u w:color="545454"/>
-                              </w:rPr>
-                              <w:t xml:space="preserve">独立设计并实现内部研发工具，以设计 DSL 连接自然语言生成、可编辑设计文档与前端资产消费。</w:t>
-                            </w:r>
-                          </w:p>
-                          <w:p>
-                            <w:pPr>
-                              <w:pStyle w:val="a3"/>
-                              <w:numPr>
-                                <w:ilvl w:val="0"/>
-                                <w:numId w:val="1"/>
-                              </w:numPr>
-                              <w:spacing w:before="0" w:after="60" w:line="320" w:lineRule="exact"/>
-                              <w:jc w:val="left"/>
-                              <w:rPr>
-                                <w:rFonts w:ascii="Microsoft YaHei" w:hAnsi="Microsoft YaHei" w:eastAsia="Microsoft YaHei" w:cs="Microsoft YaHei"/>
-                                <w:color w:val="4C4C4C"/>
-                                <w:kern w:val="24"/>
-                                <w:sz w:val="20"/>
-                                <w:szCs w:val="20"/>
-                                <w:u w:color="545454"/>
-                                <w:lang w:val="zh-TW" w:eastAsia="zh-TW"/>
-                              </w:rPr>
-                            </w:pPr>
-                            <w:r>
-                              <w:rPr>
-                                <w:rFonts w:hint="eastAsia" w:ascii="Microsoft YaHei" w:hAnsi="Microsoft YaHei" w:eastAsia="Microsoft YaHei" w:cs="Microsoft YaHei"/>
-                                <w:color w:val="4C4C4C"/>
-                                <w:kern w:val="24"/>
-                                <w:sz w:val="20"/>
-                                <w:szCs w:val="20"/>
-                                <w:u w:color="545454"/>
-                                <w:lang w:val="zh-TW" w:eastAsia="zh-TW"/>
-                              </w:rPr>
-                              <w:t xml:space="preserve">基于 React 19、Canvas、Electron 与 Tailwind CSS 构建三栏编辑器，实现图层树、属性面板、缩放平移、单选 / 多选 / 框选、跨容器拖拽、Auto Layout、基础吸附及撤销重做。</w:t>
-                            </w:r>
-                          </w:p>
-                          <w:p>
-                            <w:pPr>
-                              <w:pStyle w:val="a3"/>
-                              <w:numPr>
-                                <w:ilvl w:val="0"/>
-                                <w:numId w:val="1"/>
-                              </w:numPr>
-                              <w:spacing w:before="0" w:after="60" w:line="320" w:lineRule="exact"/>
-                              <w:jc w:val="left"/>
-                              <w:rPr>
-                                <w:rFonts w:ascii="Microsoft YaHei" w:hAnsi="Microsoft YaHei" w:eastAsia="Microsoft YaHei" w:cs="Microsoft YaHei"/>
-                                <w:color w:val="4C4C4C"/>
-                                <w:kern w:val="24"/>
-                                <w:sz w:val="20"/>
-                                <w:szCs w:val="20"/>
-                                <w:u w:color="545454"/>
-                                <w:lang w:val="zh-TW" w:eastAsia="zh-TW"/>
-                              </w:rPr>
-                            </w:pPr>
-                            <w:r>
-                              <w:rPr>
-                                <w:rFonts w:hint="eastAsia" w:ascii="Microsoft YaHei" w:hAnsi="Microsoft YaHei" w:eastAsia="Microsoft YaHei" w:cs="Microsoft YaHei"/>
-                                <w:color w:val="4C4C4C"/>
-                                <w:kern w:val="24"/>
-                                <w:sz w:val="20"/>
-                                <w:szCs w:val="20"/>
-                                <w:u w:color="545454"/>
-                                <w:lang w:val="zh-TW" w:eastAsia="zh-TW"/>
-                              </w:rPr>
-                              <w:t xml:space="preserve">用统一 DSL 表达图层、布局、样式、变量和资产关系；实现 Coordinator / Collaborator 并行生成，以 ownership、regionId、revision 和串行合并队列控制写入一致性。</w:t>
-                            </w:r>
-                          </w:p>
-                          <w:p>
-                            <w:pPr>
-                              <w:pStyle w:val="a3"/>
-                              <w:numPr>
-                                <w:ilvl w:val="0"/>
-                                <w:numId w:val="1"/>
-                              </w:numPr>
-                              <w:spacing w:before="0" w:after="60" w:line="320" w:lineRule="exact"/>
-                              <w:jc w:val="left"/>
-                              <w:rPr>
-                                <w:rFonts w:ascii="Microsoft YaHei" w:hAnsi="Microsoft YaHei" w:eastAsia="Microsoft YaHei" w:cs="Microsoft YaHei"/>
-                                <w:color w:val="4C4C4C"/>
-                                <w:kern w:val="24"/>
-                                <w:sz w:val="20"/>
-                                <w:szCs w:val="20"/>
-                                <w:u w:color="545454"/>
-                                <w:lang w:val="zh-TW" w:eastAsia="zh-TW"/>
-                              </w:rPr>
-                            </w:pPr>
-                            <w:r>
-                              <w:rPr>
-                                <w:rFonts w:hint="eastAsia" w:ascii="Microsoft YaHei" w:hAnsi="Microsoft YaHei" w:eastAsia="Microsoft YaHei" w:cs="Microsoft YaHei"/>
-                                <w:color w:val="4C4C4C"/>
-                                <w:kern w:val="24"/>
-                                <w:sz w:val="20"/>
-                                <w:szCs w:val="20"/>
-                                <w:u w:color="545454"/>
-                                <w:lang w:val="zh-TW" w:eastAsia="zh-TW"/>
-                              </w:rPr>
-                              <w:t xml:space="preserve">实现 Visual Harness 的“校验 → 局部修复 → 再校验”，按 nodeId 定位并替换问题节点，最多自动修复两轮；运行时从本地 Codex CLI 验证迁移到内置 Pi SDK。</w:t>
-                            </w:r>
-                          </w:p>
-                          <w:p>
-                            <w:pPr>
-                              <w:pStyle w:val="a3"/>
-                              <w:numPr>
-                                <w:ilvl w:val="0"/>
-                                <w:numId w:val="1"/>
-                              </w:numPr>
-                              <w:spacing w:before="0" w:after="60" w:line="320" w:lineRule="exact"/>
-                              <w:jc w:val="left"/>
-                              <w:rPr>
-                                <w:rFonts w:ascii="Microsoft YaHei" w:hAnsi="Microsoft YaHei" w:eastAsia="Microsoft YaHei" w:cs="Microsoft YaHei"/>
-                                <w:color w:val="4C4C4C"/>
-                                <w:kern w:val="24"/>
-                                <w:sz w:val="20"/>
-                                <w:szCs w:val="20"/>
-                                <w:u w:color="545454"/>
-                                <w:lang w:val="zh-TW" w:eastAsia="zh-TW"/>
-                              </w:rPr>
-                            </w:pPr>
-                            <w:r>
-                              <w:rPr>
-                                <w:rFonts w:hint="eastAsia" w:ascii="Microsoft YaHei" w:hAnsi="Microsoft YaHei" w:eastAsia="Microsoft YaHei" w:cs="Microsoft YaHei"/>
-                                <w:color w:val="4C4C4C"/>
-                                <w:kern w:val="24"/>
-                                <w:sz w:val="20"/>
-                                <w:szCs w:val="20"/>
-                                <w:u w:color="545454"/>
-                                <w:lang w:val="zh-TW" w:eastAsia="zh-TW"/>
-                              </w:rPr>
-                              <w:t xml:space="preserve">完成五类只读 MCP 工具与跨进程 Bridge，辅助外部 Agent 读取选中 Frame 生成 React 组件；打通 Electron 三入口构建、资源打包与 Fuses 加固，产出 macOS / Windows 可运行安装包。</w:t>
-                            </w:r>
-                          </w:p>
-                          <w:p>
-                            <w:pPr>
-                              <w:pStyle w:val="a3"/>
                               <w:spacing w:before="200" w:after="80" w:line="360" w:lineRule="exact"/>
                               <w:jc w:val="left"/>
                               <w:rPr>
@@ -441,188 +259,6 @@
                 <v:stroke miterlimit="4"/>
                 <v:textbox inset="1.27mm,1.27mm,1.27mm,1.27mm">
                   <w:txbxContent xmlns:w="http://schemas.openxmlformats.org/wordprocessingml/2006/main">
-                    <w:p>
-                      <w:pPr>
-                        <w:pStyle w:val="a3"/>
-                        <w:spacing w:before="0" w:after="80" w:line="360" w:lineRule="exact"/>
-                        <w:jc w:val="left"/>
-                        <w:rPr>
-                          <w:rFonts w:ascii="Microsoft YaHei" w:hAnsi="Microsoft YaHei" w:eastAsia="Microsoft YaHei" w:cs="Microsoft YaHei"/>
-                          <w:b/>
-                          <w:bCs/>
-                          <w:kern w:val="24"/>
-                          <w:sz w:val="22"/>
-                          <w:szCs w:val="22"/>
-                          <w:lang w:val="zh-TW" w:eastAsia="zh-TW"/>
-                        </w:rPr>
-                      </w:pPr>
-                      <w:r>
-                        <w:rPr>
-                          <w:rFonts w:hint="eastAsia" w:ascii="Microsoft YaHei" w:hAnsi="Microsoft YaHei" w:eastAsia="Microsoft YaHei" w:cs="Microsoft YaHei"/>
-                          <w:b/>
-                          <w:bCs/>
-                          <w:kern w:val="24"/>
-                          <w:sz w:val="22"/>
-                          <w:szCs w:val="22"/>
-                        </w:rPr>
-                        <w:t xml:space="preserve">类 Figma AI 设计与应用生成｜上海鼎歆</w:t>
-                      </w:r>
-                    </w:p>
-                    <w:p>
-                      <w:pPr>
-                        <w:pStyle w:val="a3"/>
-                        <w:spacing w:before="0" w:after="80" w:line="320" w:lineRule="exact"/>
-                        <w:jc w:val="left"/>
-                        <w:rPr>
-                          <w:rFonts w:ascii="Microsoft YaHei" w:hAnsi="Microsoft YaHei" w:eastAsia="Microsoft YaHei" w:cs="Microsoft YaHei"/>
-                          <w:color w:val="4C4C4C"/>
-                          <w:kern w:val="24"/>
-                          <w:sz w:val="20"/>
-                          <w:szCs w:val="20"/>
-                          <w:u w:color="545454"/>
-                          <w:lang w:eastAsia="zh-TW"/>
-                        </w:rPr>
-                      </w:pPr>
-                      <w:r>
-                        <w:rPr>
-                          <w:rFonts w:hint="eastAsia" w:ascii="Microsoft YaHei" w:hAnsi="Microsoft YaHei" w:eastAsia="Microsoft YaHei" w:cs="Microsoft YaHei"/>
-                          <w:color w:val="4C4C4C"/>
-                          <w:kern w:val="24"/>
-                          <w:sz w:val="20"/>
-                          <w:szCs w:val="20"/>
-                          <w:u w:color="545454"/>
-                        </w:rPr>
-                        <w:t xml:space="preserve">独立设计并实现内部研发工具，以设计 DSL 连接自然语言生成、可编辑设计文档与前端资产消费。</w:t>
-                      </w:r>
-                    </w:p>
-                    <w:p>
-                      <w:pPr>
-                        <w:pStyle w:val="a3"/>
-                        <w:numPr>
-                          <w:ilvl w:val="0"/>
-                          <w:numId w:val="1"/>
-                        </w:numPr>
-                        <w:spacing w:before="0" w:after="60" w:line="320" w:lineRule="exact"/>
-                        <w:jc w:val="left"/>
-                        <w:rPr>
-                          <w:rFonts w:ascii="Microsoft YaHei" w:hAnsi="Microsoft YaHei" w:eastAsia="Microsoft YaHei" w:cs="Microsoft YaHei"/>
-                          <w:color w:val="4C4C4C"/>
-                          <w:kern w:val="24"/>
-                          <w:sz w:val="20"/>
-                          <w:szCs w:val="20"/>
-                          <w:u w:color="545454"/>
-                          <w:lang w:val="zh-TW" w:eastAsia="zh-TW"/>
-                        </w:rPr>
-                      </w:pPr>
-                      <w:r>
-                        <w:rPr>
-                          <w:rFonts w:hint="eastAsia" w:ascii="Microsoft YaHei" w:hAnsi="Microsoft YaHei" w:eastAsia="Microsoft YaHei" w:cs="Microsoft YaHei"/>
-                          <w:color w:val="4C4C4C"/>
-                          <w:kern w:val="24"/>
-                          <w:sz w:val="20"/>
-                          <w:szCs w:val="20"/>
-                          <w:u w:color="545454"/>
-                          <w:lang w:val="zh-TW" w:eastAsia="zh-TW"/>
-                        </w:rPr>
-                        <w:t xml:space="preserve">基于 React 19、Canvas、Electron 与 Tailwind CSS 构建三栏编辑器，实现图层树、属性面板、缩放平移、单选 / 多选 / 框选、跨容器拖拽、Auto Layout、基础吸附及撤销重做。</w:t>
-                      </w:r>
-                    </w:p>
-                    <w:p>
-                      <w:pPr>
-                        <w:pStyle w:val="a3"/>
-                        <w:numPr>
-                          <w:ilvl w:val="0"/>
-                          <w:numId w:val="1"/>
-                        </w:numPr>
-                        <w:spacing w:before="0" w:after="60" w:line="320" w:lineRule="exact"/>
-                        <w:jc w:val="left"/>
-                        <w:rPr>
-                          <w:rFonts w:ascii="Microsoft YaHei" w:hAnsi="Microsoft YaHei" w:eastAsia="Microsoft YaHei" w:cs="Microsoft YaHei"/>
-                          <w:color w:val="4C4C4C"/>
-                          <w:kern w:val="24"/>
-                          <w:sz w:val="20"/>
-                          <w:szCs w:val="20"/>
-                          <w:u w:color="545454"/>
-                          <w:lang w:val="zh-TW" w:eastAsia="zh-TW"/>
-                        </w:rPr>
-                      </w:pPr>
-                      <w:r>
-                        <w:rPr>
-                          <w:rFonts w:hint="eastAsia" w:ascii="Microsoft YaHei" w:hAnsi="Microsoft YaHei" w:eastAsia="Microsoft YaHei" w:cs="Microsoft YaHei"/>
-                          <w:color w:val="4C4C4C"/>
-                          <w:kern w:val="24"/>
-                          <w:sz w:val="20"/>
-                          <w:szCs w:val="20"/>
-                          <w:u w:color="545454"/>
-                          <w:lang w:val="zh-TW" w:eastAsia="zh-TW"/>
-                        </w:rPr>
-                        <w:t xml:space="preserve">用统一 DSL 表达图层、布局、样式、变量和资产关系；实现 Coordinator / Collaborator 并行生成，以 ownership、regionId、revision 和串行合并队列控制写入一致性。</w:t>
-                      </w:r>
-                    </w:p>
-                    <w:p>
-                      <w:pPr>
-                        <w:pStyle w:val="a3"/>
-                        <w:numPr>
-                          <w:ilvl w:val="0"/>
-                          <w:numId w:val="1"/>
-                        </w:numPr>
-                        <w:spacing w:before="0" w:after="60" w:line="320" w:lineRule="exact"/>
-                        <w:jc w:val="left"/>
-                        <w:rPr>
-                          <w:rFonts w:ascii="Microsoft YaHei" w:hAnsi="Microsoft YaHei" w:eastAsia="Microsoft YaHei" w:cs="Microsoft YaHei"/>
-                          <w:color w:val="4C4C4C"/>
-                          <w:kern w:val="24"/>
-                          <w:sz w:val="20"/>
-                          <w:szCs w:val="20"/>
-                          <w:u w:color="545454"/>
-                          <w:lang w:val="zh-TW" w:eastAsia="zh-TW"/>
-                        </w:rPr>
-                      </w:pPr>
-                      <w:r>
-                        <w:rPr>
-                          <w:rFonts w:hint="eastAsia" w:ascii="Microsoft YaHei" w:hAnsi="Microsoft YaHei" w:eastAsia="Microsoft YaHei" w:cs="Microsoft YaHei"/>
-                          <w:color w:val="4C4C4C"/>
-                          <w:kern w:val="24"/>
-                          <w:sz w:val="20"/>
-                          <w:szCs w:val="20"/>
-                          <w:u w:color="545454"/>
-                          <w:lang w:val="zh-TW" w:eastAsia="zh-TW"/>
-                        </w:rPr>
-                        <w:t xml:space="preserve">实现 Visual Harness 的“校验 → 局部修复 → 再校验”，按 nodeId 定位并替换问题节点，最多自动修复两轮；运行时从本地 Codex CLI 验证迁移到内置 Pi SDK。</w:t>
-                      </w:r>
-                    </w:p>
-                    <w:p>
-                      <w:pPr>
-                        <w:pStyle w:val="a3"/>
-                        <w:numPr>
-                          <w:ilvl w:val="0"/>
-                          <w:numId w:val="1"/>
-                        </w:numPr>
-                        <w:spacing w:before="0" w:after="60" w:line="320" w:lineRule="exact"/>
-                        <w:jc w:val="left"/>
-                        <w:rPr>
-                          <w:rFonts w:ascii="Microsoft YaHei" w:hAnsi="Microsoft YaHei" w:eastAsia="Microsoft YaHei" w:cs="Microsoft YaHei"/>
-                          <w:color w:val="4C4C4C"/>
-                          <w:kern w:val="24"/>
-                          <w:sz w:val="20"/>
-                          <w:szCs w:val="20"/>
-                          <w:u w:color="545454"/>
-                          <w:lang w:val="zh-TW" w:eastAsia="zh-TW"/>
-                        </w:rPr>
-                      </w:pPr>
-                      <w:r>
-                        <w:rPr>
-                          <w:rFonts w:hint="eastAsia" w:ascii="Microsoft YaHei" w:hAnsi="Microsoft YaHei" w:eastAsia="Microsoft YaHei" w:cs="Microsoft YaHei"/>
-                          <w:color w:val="4C4C4C"/>
-                          <w:kern w:val="24"/>
-                          <w:sz w:val="20"/>
-                          <w:szCs w:val="20"/>
-                          <w:u w:color="545454"/>
-                          <w:lang w:val="zh-TW" w:eastAsia="zh-TW"/>
-                        </w:rPr>
-                        <w:t xml:space="preserve">完成五类只读 MCP 工具与跨进程 Bridge，辅助外部 Agent 读取选中 Frame 生成 React 组件；打通 Electron 三入口构建、资源打包与 Fuses 加固，产出 macOS / Windows 可运行安装包。</w:t>
-                      </w:r>
-                    </w:p>
                     <w:p>
                       <w:pPr>
                         <w:pStyle w:val="a3"/>
@@ -1851,7 +1487,7 @@
                                 <w:u w:color="545454"/>
                                 <w:lang w:eastAsia="zh-Hans"/>
                               </w:rPr>
-                              <w:t xml:space="preserve">Canvas、React Flow、Tiptap 编辑器，使用 Tailwind CSS、Radix UI 实现交互。</w:t>
+                              <w:t xml:space="preserve">React Flow、Tiptap 编辑器，使用 Tailwind CSS、Radix UI 实现交互。</w:t>
                             </w:r>
                           </w:p>
                           <w:p>
@@ -1902,36 +1538,6 @@
                             </w:pPr>
                             <w:r>
                               <w:rPr>
-                                <w:rFonts w:hint="eastAsia" w:ascii="Microsoft YaHei" w:hAnsi="Microsoft YaHei" w:eastAsia="Microsoft YaHei" w:cs="Microsoft YaHei"/>
-                                <w:color w:val="4C4C4C"/>
-                                <w:kern w:val="24"/>
-                                <w:sz w:val="20"/>
-                                <w:szCs w:val="20"/>
-                                <w:u w:color="545454"/>
-                                <w:lang w:eastAsia="zh-Hans"/>
-                              </w:rPr>
-                              <w:t xml:space="preserve">Electron 三入口构建、Fuses 加固及 macOS / Windows 安装包交付。</w:t>
-                            </w:r>
-                          </w:p>
-                          <w:p>
-                            <w:pPr>
-                              <w:pStyle w:val="a3"/>
-                              <w:numPr>
-                                <w:ilvl w:val="0"/>
-                                <w:numId w:val="2"/>
-                              </w:numPr>
-                              <w:spacing w:before="0" w:after="0" w:line="300" w:lineRule="exact"/>
-                              <w:jc w:val="left"/>
-                              <w:rPr>
-                                <w:rFonts w:ascii="Microsoft YaHei" w:hAnsi="Microsoft YaHei" w:eastAsia="Microsoft YaHei" w:cs="Microsoft YaHei"/>
-                                <w:color w:val="4C4C4C"/>
-                                <w:sz w:val="20"/>
-                                <w:szCs w:val="20"/>
-                                <w:lang w:val="zh-TW" w:eastAsia="zh-TW"/>
-                              </w:rPr>
-                            </w:pPr>
-                            <w:r>
-                              <w:rPr>
                                 <w:rFonts w:ascii="Microsoft YaHei" w:hAnsi="Microsoft YaHei" w:eastAsia="Microsoft YaHei" w:cs="Microsoft YaHei"/>
                                 <w:color w:val="4C4C4C"/>
                                 <w:kern w:val="24"/>
@@ -1997,7 +1603,7 @@
                                 <w:sz w:val="20"/>
                                 <w:szCs w:val="20"/>
                               </w:rPr>
-                              <w:t xml:space="preserve">AI 设计生成、结构校验与局部修复；以测试、运行日志和监控验证交付。</w:t>
+                              <w:t xml:space="preserve">以测试、运行日志和监控验证交付。</w:t>
                             </w:r>
                           </w:p>
                         </w:txbxContent>
@@ -2074,7 +1680,7 @@
                           <w:u w:color="545454"/>
                           <w:lang w:eastAsia="zh-Hans"/>
                         </w:rPr>
-                        <w:t xml:space="preserve">Canvas、React Flow、Tiptap 编辑器，使用 Tailwind CSS、Radix UI 实现交互。</w:t>
+                        <w:t xml:space="preserve">React Flow、Tiptap 编辑器，使用 Tailwind CSS、Radix UI 实现交互。</w:t>
                       </w:r>
                     </w:p>
                     <w:p>
@@ -2125,36 +1731,6 @@
                       </w:pPr>
                       <w:r>
                         <w:rPr>
-                          <w:rFonts w:hint="eastAsia" w:ascii="Microsoft YaHei" w:hAnsi="Microsoft YaHei" w:eastAsia="Microsoft YaHei" w:cs="Microsoft YaHei"/>
-                          <w:color w:val="4C4C4C"/>
-                          <w:kern w:val="24"/>
-                          <w:sz w:val="20"/>
-                          <w:szCs w:val="20"/>
-                          <w:u w:color="545454"/>
-                          <w:lang w:eastAsia="zh-Hans"/>
-                        </w:rPr>
-                        <w:t xml:space="preserve">Electron 三入口构建、Fuses 加固及 macOS / Windows 安装包交付。</w:t>
-                      </w:r>
-                    </w:p>
-                    <w:p>
-                      <w:pPr>
-                        <w:pStyle w:val="a3"/>
-                        <w:numPr>
-                          <w:ilvl w:val="0"/>
-                          <w:numId w:val="2"/>
-                        </w:numPr>
-                        <w:spacing w:before="0" w:after="0" w:line="300" w:lineRule="exact"/>
-                        <w:jc w:val="left"/>
-                        <w:rPr>
-                          <w:rFonts w:ascii="Microsoft YaHei" w:hAnsi="Microsoft YaHei" w:eastAsia="Microsoft YaHei" w:cs="Microsoft YaHei"/>
-                          <w:color w:val="4C4C4C"/>
-                          <w:sz w:val="20"/>
-                          <w:szCs w:val="20"/>
-                          <w:lang w:val="zh-TW" w:eastAsia="zh-TW"/>
-                        </w:rPr>
-                      </w:pPr>
-                      <w:r>
-                        <w:rPr>
                           <w:rFonts w:ascii="Microsoft YaHei" w:hAnsi="Microsoft YaHei" w:eastAsia="Microsoft YaHei" w:cs="Microsoft YaHei"/>
                           <w:color w:val="4C4C4C"/>
                           <w:kern w:val="24"/>
@@ -2220,7 +1796,7 @@
                           <w:sz w:val="20"/>
                           <w:szCs w:val="20"/>
                         </w:rPr>
-                        <w:t xml:space="preserve">AI 设计生成、结构校验与局部修复；以测试、运行日志和监控验证交付。</w:t>
+                        <w:t xml:space="preserve">以测试、运行日志和监控验证交付。</w:t>
                       </w:r>
                     </w:p>
                   </w:txbxContent>

</xml_diff>